<commit_message>
Correct engine3 claims: judge gain follows extra successes; the floating-point success is only partly correct; untested-line resolution was not measured
Found by a post-hoc analysis of all 126 sessions (property tests, per-pass judge scores, review logs).

Co-Authored-By: Claude Opus 5.5 <noreply@anthropic.com>
</commit_message>
<xml_diff>
--- a/paper/MIHAD_Research_Paper_EN_v1.9.docx
+++ b/paper/MIHAD_Research_Paper_EN_v1.9.docx
@@ -140,7 +140,7 @@
           <w:color w:val="000000"/>
           <w:lang w:val="en-US"/>
         </w:rPr>
-        <w:t>An experience engine that turns sessions into operational experience did better. It mines tool pitfalls, verifier scripts, the user's corrections and compiled skills, and gives a brief and a review sized by competence. It promotes a lesson only after an A/B test on practice tasks made by mutating past fixes. With this engine a weaker model kept the same success as without memory (11/14) at 14.4% lower cost, and the blind judge's quality score did not fall (3.93 vs 3.79). A second version that added a generic edge-case checklist and a stronger-model advisor did not raise success (10/14), cost more, and scored lower; generic guidance in every session behaves as noise. A third version replaced advice with executable review checks: before finishing, each line the agent added is mutated to see whether the tests notice, and formatting, lint and preference compliance are checked against the starting commit. Over three repetitions (42 runs per version) it raised success to 35/42 against 32/42 for both other versions and the judge's score to 3.98 against 3.74, with no formatting regressions against ten, for 2% more cost. Only one of the three extra successes is clearly caused by a finding, so the firm effect is on quality. All results are exploratory and come from one main repository; only the last experiment was repeated. The tool has been generalized into a standalone package for ten programming languages. No claim of machine consciousness is made.</w:t>
+        <w:t>An experience engine that turns sessions into operational experience did better. It mines tool pitfalls, verifier scripts, the user's corrections and compiled skills, and gives a brief and a review sized by competence. It promotes a lesson only after an A/B test on practice tasks made by mutating past fixes. With this engine a weaker model kept the same success as without memory (11/14) at 14.4% lower cost, and the blind judge's quality score did not fall (3.93 vs 3.79). A second version that added a generic edge-case checklist and a stronger-model advisor did not raise success (10/14), cost more, and scored lower; generic guidance in every session behaves as noise. A third version replaced advice with executable review checks: before finishing, each line the agent added is mutated to see whether the tests notice, and formatting, lint and preference compliance are checked against the starting commit. Over three repetitions (42 runs per version) it raised success to 35/42 against 32/42 for both other versions, with no formatting regressions against ten, for 2% more cost. The judge's score rose to 3.98 against 3.74, but this follows the extra successes: among successful runs the versions differ by at most 0.11. Only one of the three extra successes is clearly linked to a finding, and property tests show that solution to be only partly correct, so the firm effect is on formatting. All results are exploratory and come from one main repository; only the last experiment was repeated. The tool has been generalized into a standalone package for ten programming languages. No claim of machine consciousness is made.</w:t>
       </w:r>
     </w:p>
     <w:p>
@@ -20412,7 +20412,7 @@
           <w:color w:val="000000"/>
           <w:lang w:val="en-US"/>
         </w:rPr>
-        <w:t>• a judge score 0.24 higher, mostly from correctness (4.26 against 3.95);</w:t>
+        <w:t>• a judge score 0.24 higher;</w:t>
       </w:r>
     </w:p>
     <w:p>
@@ -20448,7 +20448,7 @@
           <w:color w:val="000000"/>
           <w:lang w:val="en-US"/>
         </w:rPr>
-        <w:t>Ten of its sessions added a test, against six for v1 and seven without memory.</w:t>
+        <w:t>The judge's gain, however, is not better solutions. The judge largely restates pass or fail (4.44 for passing runs, 1.48 for failing ones). Among passing runs alone, the three versions score 4.38, 4.47 and 4.49. The 0.24 therefore comes from the three extra successes, and the only quality gain independent of success is formatting. Ten of the sessions with checks added a test, against six for v1 and seven without memory.</w:t>
       </w:r>
     </w:p>
     <w:p>
@@ -20496,7 +20496,7 @@
           <w:color w:val="000000"/>
           <w:lang w:val="en-US"/>
         </w:rPr>
-        <w:t>One is clearly caused by a finding.</w:t>
+        <w:t>One is linked to a finding.</w:t>
       </w:r>
       <w:r>
         <w:rPr>
@@ -20532,7 +20532,31 @@
           <w:color w:val="000000"/>
           <w:lang w:val="en-US"/>
         </w:rPr>
-        <w:t>.</w:t>
+        <w:t>, which the hidden tests required. But a randomized property test on range boundaries (</w:t>
+      </w:r>
+      <w:r>
+        <w:rPr>
+          <w:rFonts w:ascii="Consolas" w:hAnsi="Consolas" w:cs="Consolas" w:eastAsia="Consolas"/>
+          <w:sz w:val="20"/>
+          <w:szCs w:val="20"/>
+          <w:b w:val="0"/>
+          <w:bCs w:val="0"/>
+          <w:color w:val="000000"/>
+          <w:lang w:val="en-US"/>
+        </w:rPr>
+        <w:t>len(list(r)) == len(r)</w:t>
+      </w:r>
+      <w:r>
+        <w:rPr>
+          <w:rFonts w:ascii="Cambria" w:hAnsi="Cambria" w:cs="Cambria" w:eastAsia="Cambria"/>
+          <w:sz w:val="22"/>
+          <w:szCs w:val="22"/>
+          <w:b w:val="0"/>
+          <w:bCs w:val="0"/>
+          <w:color w:val="000000"/>
+          <w:lang w:val="en-US"/>
+        </w:rPr>
+        <w:t>) fails on 244 of 20,000 cases for this solution and 0 for the reference, and the solution introduces a new length error for one decreasing range. It passes the hidden tests without being fully correct.</w:t>
       </w:r>
     </w:p>
     <w:p>
@@ -20635,15 +20659,20 @@
           <w:color w:val="000000"/>
           <w:lang w:val="en-US"/>
         </w:rPr>
-        <w:t>The steady effect is on quality, and its mechanism is visible in the logs. Findings appeared in 21 of 41 reviewed sessions, and the agents acted on them unevenly:</w:t>
+        <w:t>Findings appeared in 21 of 41 reviewed sessions. Formatting findings were almost always fixed (13 of 14). For untested-line findings the harness did not re-run the review after the agent's reply, so their resolution was not measured. An inspection of the logs found three delivery problems: in 2 of 12 blocked sessions the agent received no turn after the block, and in one the session ended mid-reply. In others the agent added a test that does not kill the mutant, or a test for a near-equivalent mutant (</w:t>
       </w:r>
-    </w:p>
-    <w:p>
-      <w:pPr>
-        <w:spacing w:after="60"/>
-        <w:ind w:left="432" w:hanging="259"/>
-        <w:jc w:val="left"/>
-      </w:pPr>
+      <w:r>
+        <w:rPr>
+          <w:rFonts w:ascii="Consolas" w:hAnsi="Consolas" w:cs="Consolas" w:eastAsia="Consolas"/>
+          <w:sz w:val="20"/>
+          <w:szCs w:val="20"/>
+          <w:b w:val="0"/>
+          <w:bCs w:val="0"/>
+          <w:color w:val="000000"/>
+          <w:lang w:val="en-US"/>
+        </w:rPr>
+        <w:t>return False</w:t>
+      </w:r>
       <w:r>
         <w:rPr>
           <w:rFonts w:ascii="Cambria" w:hAnsi="Cambria" w:cs="Cambria" w:eastAsia="Cambria"/>
@@ -20654,15 +20683,20 @@
           <w:color w:val="000000"/>
           <w:lang w:val="en-US"/>
         </w:rPr>
-        <w:t>• they fixed 13 of 14 formatting findings;</w:t>
+        <w:t xml:space="preserve"> replaced by </w:t>
       </w:r>
-    </w:p>
-    <w:p>
-      <w:pPr>
-        <w:spacing w:after="60"/>
-        <w:ind w:left="432" w:hanging="259"/>
-        <w:jc w:val="left"/>
-      </w:pPr>
+      <w:r>
+        <w:rPr>
+          <w:rFonts w:ascii="Consolas" w:hAnsi="Consolas" w:cs="Consolas" w:eastAsia="Consolas"/>
+          <w:sz w:val="20"/>
+          <w:szCs w:val="20"/>
+          <w:b w:val="0"/>
+          <w:bCs w:val="0"/>
+          <w:color w:val="000000"/>
+          <w:lang w:val="en-US"/>
+        </w:rPr>
+        <w:t>pass</w:t>
+      </w:r>
       <w:r>
         <w:rPr>
           <w:rFonts w:ascii="Cambria" w:hAnsi="Cambria" w:cs="Cambria" w:eastAsia="Cambria"/>
@@ -20673,24 +20707,7 @@
           <w:color w:val="000000"/>
           <w:lang w:val="en-US"/>
         </w:rPr>
-        <w:t>• they fixed only 8 of 17 untested-line findings.</w:t>
-      </w:r>
-    </w:p>
-    <w:p>
-      <w:pPr>
-        <w:jc w:val="both"/>
-      </w:pPr>
-      <w:r>
-        <w:rPr>
-          <w:rFonts w:ascii="Cambria" w:hAnsi="Cambria" w:cs="Cambria" w:eastAsia="Cambria"/>
-          <w:sz w:val="22"/>
-          <w:szCs w:val="22"/>
-          <w:b w:val="0"/>
-          <w:bCs w:val="0"/>
-          <w:color w:val="000000"/>
-          <w:lang w:val="en-US"/>
-        </w:rPr>
-        <w:t xml:space="preserve">Turning an untested-line finding into a test is the step the weaker model most often skips. The quality metric also flagged three "weakened tests"; on inspection, each replaced </w:t>
+        <w:t xml:space="preserve">). The quality metric also flagged three "weakened tests"; on inspection, each replaced </w:t>
       </w:r>
       <w:r>
         <w:rPr>
@@ -22914,7 +22931,7 @@
           <w:color w:val="000000"/>
           <w:lang w:val="en-US"/>
         </w:rPr>
-        <w:t>What transferred between different tasks was operational experience about the environment and its tools, learned from the agent's own sessions and promoted only when an A/B test on practice tasks showed that it saved effort without losing success. With it a weaker model kept its success at lower cost and unchanged quality. Generic advice added in every session did not help and lowered quality. Specific facts did: an executable review that runs the agent's change and reports what it observed raised quality across three repetitions. It also gave the first solution of a floating-point task that every earlier variant had failed. The task whose intent is unstated was still never solved.</w:t>
+        <w:t>What transferred between different tasks was operational experience about the environment and its tools, learned from the agent's own sessions and promoted only when an A/B test on practice tasks showed that it saved effort without losing success. With it a weaker model kept its success at lower cost and unchanged quality. Generic advice added in every session did not help and lowered quality. Specific facts did better: an executable review that runs the agent's change and reports what it observed removed formatting regressions across three repetitions and added three successes, one of them linked to a finding. That one passes the hidden tests of a floating-point task every earlier variant had failed, although property tests show it is only partly correct. The task whose intent is unstated was still never solved.</w:t>
       </w:r>
     </w:p>
     <w:p>
@@ -22931,7 +22948,7 @@
           <w:color w:val="000000"/>
           <w:lang w:val="en-US"/>
         </w:rPr>
-        <w:t>The next steps are to run the engine on a second repository and calibrate the judge with human ratings. They also include turning untested-line findings into proposed tests, since the weaker model acted on only half of them. Finally, the tool should be tested on a real project, where the question is whether the engine learns from the user's own corrections something that saves the user work. The conclusions remain limited to the tasks and models tested, and this version does not establish the broader research goal.</w:t>
+        <w:t>The next steps are to run the engine on a second repository and calibrate the judge with human ratings. They also include closing the loop on untested-line findings (re-running the mutant against the agent's new test and giving an input that reaches the line), and checks of properties of the changed function, which in a post-hoc analysis detect the errors of most failed runs within a second. Finally, the tool should be tested on a real project, where the question is whether the engine learns from the user's own corrections something that saves the user work. The conclusions remain limited to the tasks and models tested, and this version does not establish the broader research goal.</w:t>
       </w:r>
     </w:p>
     <w:p>

</xml_diff>